<commit_message>
transformation from research to personal project with name
</commit_message>
<xml_diff>
--- a/memos/2026-09-07-eeg-affect-manifold-geometry/index.docx
+++ b/memos/2026-09-07-eeg-affect-manifold-geometry/index.docx
@@ -1908,53 +1908,6 @@
       </w:r>
       <w:r>
         <w:t xml:space="preserve">). But human feelings are much richer than that.</w:t>
-      </w:r>
-    </w:p>
-    <w:p>
-      <w:pPr>
-        <w:pStyle w:val="BodyText"/>
-      </w:pPr>
-      <w:r>
-        <w:t xml:space="preserve">Cowen and Keltner</w:t>
-      </w:r>
-      <w:r>
-        <w:t xml:space="preserve"> </w:t>
-      </w:r>
-      <w:r>
-        <w:t xml:space="preserve">(</w:t>
-      </w:r>
-      <w:hyperlink w:anchor="ref-cowen2017twenty">
-        <w:r>
-          <w:rPr>
-            <w:rStyle w:val="Hyperlink"/>
-          </w:rPr>
-          <w:t xml:space="preserve">2017</w:t>
-        </w:r>
-      </w:hyperlink>
-      <w:r>
-        <w:t xml:space="preserve">)</w:t>
-      </w:r>
-      <w:r>
-        <w:t xml:space="preserve"> </w:t>
-      </w:r>
-      <w:r>
-        <w:t xml:space="preserve">showed through massive self-report studies that human emotion is organized into at least</w:t>
-      </w:r>
-      <w:r>
-        <w:t xml:space="preserve"> </w:t>
-      </w:r>
-      <w:r>
-        <w:rPr>
-          <w:b/>
-          <w:bCs/>
-        </w:rPr>
-        <w:t xml:space="preserve">27 distinct categories</w:t>
-      </w:r>
-      <w:r>
-        <w:t xml:space="preserve"> </w:t>
-      </w:r>
-      <w:r>
-        <w:t xml:space="preserve">along a continuous semantic geometry.</w:t>
       </w:r>
     </w:p>
     <w:p>
@@ -1995,7 +1948,7 @@
         </m:r>
       </m:oMath>
       <w:r>
-        <w:t xml:space="preserve">) per trial. From a computer science and geometric ML standpoint, we want to answer three specific questions:</w:t>
+        <w:t xml:space="preserve">) per trial. We set out to investigate three core questions:</w:t>
       </w:r>
     </w:p>
     <w:p>
@@ -10419,57 +10372,15 @@
         </m:r>
       </m:oMath>
     </w:p>
-    <w:p>
-      <w:pPr>
-        <w:pStyle w:val="FirstParagraph"/>
-      </w:pPr>
-      <w:r>
-        <w:t xml:space="preserve">The mean feature vectors achieved a Pearson correlation of</w:t>
-      </w:r>
-      <w:r>
-        <w:t xml:space="preserve"> </w:t>
-      </w:r>
-      <m:oMath>
-        <m:r>
-          <m:t>r</m:t>
-        </m:r>
-        <m:r>
-          <m:rPr>
-            <m:sty m:val="p"/>
-          </m:rPr>
-          <m:t>&gt;</m:t>
-        </m:r>
-        <m:r>
-          <m:t>0.98</m:t>
-        </m:r>
-      </m:oMath>
-      <w:r>
-        <w:t xml:space="preserve"> </w:t>
-      </w:r>
-      <w:r>
-        <w:t xml:space="preserve">with real human data (</w:t>
-      </w:r>
-      <w:hyperlink w:anchor="fig-generative">
-        <w:r>
-          <w:rPr>
-            <w:rStyle w:val="Hyperlink"/>
-          </w:rPr>
-          <w:t xml:space="preserve">Figure 7</w:t>
-        </w:r>
-      </w:hyperlink>
-      <w:r>
-        <w:t xml:space="preserve">). This shows that regularized Gaussian sampling gives us a fast, stable generative pipeline that avoids the mode collapse and training instability of GANs.</w:t>
-      </w:r>
-    </w:p>
     <w:bookmarkEnd w:id="65"/>
     <w:bookmarkEnd w:id="66"/>
-    <w:bookmarkStart w:id="70" w:name="Xa05869402cb337e377e77d71affb958f518e1c7"/>
+    <w:bookmarkStart w:id="70" w:name="part-5-discussion-future-work"/>
     <w:p>
       <w:pPr>
         <w:pStyle w:val="Heading2"/>
       </w:pPr>
       <w:r>
-        <w:t xml:space="preserve">Part 5: Research Directions for Dr. Bhaskar’s Lab</w:t>
+        <w:t xml:space="preserve">Part 5: Discussion &amp; Future Work</w:t>
       </w:r>
     </w:p>
     <w:p>
@@ -10477,23 +10388,7 @@
         <w:pStyle w:val="FirstParagraph"/>
       </w:pPr>
       <w:r>
-        <w:t xml:space="preserve">As a computer science student interested in geometric ML and computational biology, these findings open up exciting directions that directly connect to</w:t>
-      </w:r>
-      <w:r>
-        <w:t xml:space="preserve"> </w:t>
-      </w:r>
-      <w:r>
-        <w:rPr>
-          <w:b/>
-          <w:bCs/>
-        </w:rPr>
-        <w:t xml:space="preserve">Professor Dhananjay Bhaskar’s research group</w:t>
-      </w:r>
-      <w:r>
-        <w:t xml:space="preserve"> </w:t>
-      </w:r>
-      <w:r>
-        <w:t xml:space="preserve">at UW-Madison:</w:t>
+        <w:t xml:space="preserve">These findings suggest several promising directions for geometric deep learning and computational neuroscience:</w:t>
       </w:r>
     </w:p>
     <w:bookmarkStart w:id="67" w:name="X27d288d1025773492bc42fae2fa21a85a5c7570"/>
@@ -10584,7 +10479,7 @@
         <w:t xml:space="preserve"> </w:t>
       </w:r>
       <w:r>
-        <w:t xml:space="preserve">We can add a persistent homology penalty to our Bottleneck MLP loss function to force latent representations to preserve global loop structures.</w:t>
+        <w:t xml:space="preserve">Adding a persistent homology penalty to the neural network loss function could constrain latent representations to preserve global loop and void structures.</w:t>
       </w:r>
     </w:p>
     <w:bookmarkEnd w:id="67"/>
@@ -10716,7 +10611,7 @@
         </m:sSubSup>
       </m:oMath>
       <w:r>
-        <w:t xml:space="preserve">. Instead of flattening matrices into Euclidean vectors, we can use Riemannian geometry (like the Log-Euclidean Metric or Affine-Invariant Riemannian Metric) with SPDNet architectures.</w:t>
+        <w:t xml:space="preserve">. Rather than flattening matrices into Euclidean vectors, we can operate directly in Riemannian geometry using the Log-Euclidean Metric or Affine-Invariant Riemannian Metric with SPDNet architectures.</w:t>
       </w:r>
     </w:p>
     <w:p>
@@ -10738,17 +10633,17 @@
         <w:t xml:space="preserve"> </w:t>
       </w:r>
       <w:r>
-        <w:t xml:space="preserve">Treating the 14 electrodes as nodes in a dynamic graph where edge weights represent time-varying coherence or phase-locking values.</w:t>
+        <w:t xml:space="preserve">Treating electrodes as nodes in a dynamic graph where edge weights represent time-varying coherence or phase-locking values across channels.</w:t>
       </w:r>
     </w:p>
     <w:bookmarkEnd w:id="68"/>
-    <w:bookmarkStart w:id="69" w:name="non-linear-trajectory-inference"/>
+    <w:bookmarkStart w:id="69" w:name="continuous-trajectory-inference"/>
     <w:p>
       <w:pPr>
         <w:pStyle w:val="Heading3"/>
       </w:pPr>
       <w:r>
-        <w:t xml:space="preserve">3. Non-Linear Trajectory Inference</w:t>
+        <w:t xml:space="preserve">3. Continuous Trajectory Inference</w:t>
       </w:r>
     </w:p>
     <w:p>
@@ -10770,7 +10665,7 @@
         <w:t xml:space="preserve"> </w:t>
       </w:r>
       <w:r>
-        <w:t xml:space="preserve">We can use tools like PHATE</w:t>
+        <w:t xml:space="preserve">Applying tools like PHATE</w:t>
       </w:r>
       <w:r>
         <w:t xml:space="preserve"> </w:t>
@@ -10793,7 +10688,7 @@
         <w:t xml:space="preserve"> </w:t>
       </w:r>
       <w:r>
-        <w:t xml:space="preserve">to trace continuous trajectories between emotions, identifying the exact branch points where mixed emotional states (like bittersweet or nostalgic feelings) bifurcate into distinct categorical states.</w:t>
+        <w:t xml:space="preserve">can help trace continuous trajectories between emotions, identifying the exact branch points where mixed affective states (such as bittersweet or nostalgic feelings) bifurcate into distinct categories.</w:t>
       </w:r>
     </w:p>
     <w:bookmarkEnd w:id="69"/>

</xml_diff>